<commit_message>
Conclusão da Fase 3: Integração do gerador Word com conversão automática para PDF e suporte ao deploy em Linux
</commit_message>
<xml_diff>
--- a/templates/modelo.docx
+++ b/templates/modelo.docx
@@ -62,7 +62,7 @@
                 <w:szCs w:val="16"/>
               </w:rPr>
               <w:drawing>
-                <wp:anchor distT="0" distB="0" distL="114300" distR="114300" simplePos="0" relativeHeight="251658240" behindDoc="0" locked="0" layoutInCell="1" allowOverlap="1" wp14:anchorId="3275B5F9" wp14:editId="2B1282FA">
+                <wp:anchor distT="0" distB="0" distL="114300" distR="114300" simplePos="0" relativeHeight="251658240" behindDoc="0" locked="0" layoutInCell="1" allowOverlap="1" wp14:anchorId="3275B5F9" wp14:editId="1BA3EB19">
                   <wp:simplePos x="0" y="0"/>
                   <wp:positionH relativeFrom="page">
                     <wp:posOffset>1155065</wp:posOffset>
@@ -5327,78 +5327,6 @@
           <w:szCs w:val="16"/>
         </w:rPr>
       </w:pPr>
-      <w:r>
-        <w:rPr>
-          <w:b/>
-          <w:bCs/>
-          <w:sz w:val="16"/>
-          <w:szCs w:val="16"/>
-        </w:rPr>
-        <w:t xml:space="preserve">Taxa de urgência: R$ </w:t>
-      </w:r>
-      <w:r>
-        <w:rPr>
-          <w:b/>
-          <w:bCs/>
-          <w:sz w:val="16"/>
-          <w:szCs w:val="16"/>
-        </w:rPr>
-        <w:t>1</w:t>
-      </w:r>
-      <w:r>
-        <w:rPr>
-          <w:b/>
-          <w:bCs/>
-          <w:sz w:val="16"/>
-          <w:szCs w:val="16"/>
-        </w:rPr>
-        <w:t>9</w:t>
-      </w:r>
-      <w:r>
-        <w:rPr>
-          <w:b/>
-          <w:bCs/>
-          <w:sz w:val="16"/>
-          <w:szCs w:val="16"/>
-        </w:rPr>
-        <w:t>0,00</w:t>
-      </w:r>
-      <w:r>
-        <w:rPr>
-          <w:b/>
-          <w:bCs/>
-          <w:sz w:val="16"/>
-          <w:szCs w:val="16"/>
-        </w:rPr>
-        <w:t xml:space="preserve"> (Taxa cobrada </w:t>
-      </w:r>
-      <w:r>
-        <w:rPr>
-          <w:b/>
-          <w:bCs/>
-          <w:sz w:val="16"/>
-          <w:szCs w:val="16"/>
-        </w:rPr>
-        <w:t>pedido</w:t>
-      </w:r>
-      <w:r>
-        <w:rPr>
-          <w:b/>
-          <w:bCs/>
-          <w:sz w:val="16"/>
-          <w:szCs w:val="16"/>
-        </w:rPr>
-        <w:t xml:space="preserve"> fora do horário de corte ou atendimento fora do horário solicitado)</w:t>
-      </w:r>
-      <w:r>
-        <w:rPr>
-          <w:b/>
-          <w:bCs/>
-          <w:sz w:val="16"/>
-          <w:szCs w:val="16"/>
-        </w:rPr>
-        <w:br/>
-      </w:r>
     </w:p>
     <w:p>
       <w:pPr>
@@ -5411,105 +5339,6 @@
           <w:szCs w:val="16"/>
         </w:rPr>
       </w:pPr>
-      <w:r>
-        <w:rPr>
-          <w:b/>
-          <w:bCs/>
-          <w:sz w:val="16"/>
-          <w:szCs w:val="16"/>
-        </w:rPr>
-        <w:t>Horário de corte para colocação de pedidos:</w:t>
-      </w:r>
-      <w:r>
-        <w:rPr>
-          <w:b/>
-          <w:bCs/>
-          <w:sz w:val="16"/>
-          <w:szCs w:val="16"/>
-        </w:rPr>
-        <w:t xml:space="preserve"> </w:t>
-      </w:r>
-      <w:r>
-        <w:rPr>
-          <w:b/>
-          <w:bCs/>
-          <w:sz w:val="16"/>
-          <w:szCs w:val="16"/>
-        </w:rPr>
-        <w:t xml:space="preserve">Até </w:t>
-      </w:r>
-      <w:r>
-        <w:rPr>
-          <w:b/>
-          <w:bCs/>
-          <w:sz w:val="16"/>
-          <w:szCs w:val="16"/>
-        </w:rPr>
-        <w:t>1</w:t>
-      </w:r>
-      <w:r>
-        <w:rPr>
-          <w:b/>
-          <w:bCs/>
-          <w:sz w:val="16"/>
-          <w:szCs w:val="16"/>
-        </w:rPr>
-        <w:t>2</w:t>
-      </w:r>
-      <w:r>
-        <w:rPr>
-          <w:b/>
-          <w:bCs/>
-          <w:sz w:val="16"/>
-          <w:szCs w:val="16"/>
-        </w:rPr>
-        <w:t>:</w:t>
-      </w:r>
-      <w:r>
-        <w:rPr>
-          <w:b/>
-          <w:bCs/>
-          <w:sz w:val="16"/>
-          <w:szCs w:val="16"/>
-        </w:rPr>
-        <w:t>00</w:t>
-      </w:r>
-      <w:r>
-        <w:rPr>
-          <w:b/>
-          <w:bCs/>
-          <w:sz w:val="16"/>
-          <w:szCs w:val="16"/>
-        </w:rPr>
-        <w:t xml:space="preserve"> horas</w:t>
-      </w:r>
-      <w:r>
-        <w:rPr>
-          <w:b/>
-          <w:bCs/>
-          <w:sz w:val="16"/>
-          <w:szCs w:val="16"/>
-        </w:rPr>
-        <w:t xml:space="preserve"> D</w:t>
-      </w:r>
-      <w:r>
-        <w:rPr>
-          <w:b/>
-          <w:bCs/>
-          <w:sz w:val="16"/>
-          <w:szCs w:val="16"/>
-        </w:rPr>
-        <w:t>+</w:t>
-      </w:r>
-      <w:r>
-        <w:rPr>
-          <w:b/>
-          <w:bCs/>
-          <w:sz w:val="16"/>
-          <w:szCs w:val="16"/>
-        </w:rPr>
-        <w:t>1</w:t>
-      </w:r>
     </w:p>
     <w:p>
       <w:pPr>
@@ -5530,7 +5359,7 @@
           <w:szCs w:val="16"/>
         </w:rPr>
         <w:lastRenderedPageBreak/>
-        <w:t xml:space="preserve">Recebimento / </w:t>
+        <w:t xml:space="preserve">Taxa de urgência: R$ </w:t>
       </w:r>
       <w:r>
         <w:rPr>
@@ -5539,7 +5368,52 @@
           <w:sz w:val="16"/>
           <w:szCs w:val="16"/>
         </w:rPr>
-        <w:t>Conforme política de recebimento Anexo II</w:t>
+        <w:t>1</w:t>
+      </w:r>
+      <w:r>
+        <w:rPr>
+          <w:b/>
+          <w:bCs/>
+          <w:sz w:val="16"/>
+          <w:szCs w:val="16"/>
+        </w:rPr>
+        <w:t>9</w:t>
+      </w:r>
+      <w:r>
+        <w:rPr>
+          <w:b/>
+          <w:bCs/>
+          <w:sz w:val="16"/>
+          <w:szCs w:val="16"/>
+        </w:rPr>
+        <w:t>0,00</w:t>
+      </w:r>
+      <w:r>
+        <w:rPr>
+          <w:b/>
+          <w:bCs/>
+          <w:sz w:val="16"/>
+          <w:szCs w:val="16"/>
+        </w:rPr>
+        <w:t xml:space="preserve"> (Taxa cobrada </w:t>
+      </w:r>
+      <w:r>
+        <w:rPr>
+          <w:b/>
+          <w:bCs/>
+          <w:sz w:val="16"/>
+          <w:szCs w:val="16"/>
+        </w:rPr>
+        <w:t>pedido</w:t>
+      </w:r>
+      <w:r>
+        <w:rPr>
+          <w:b/>
+          <w:bCs/>
+          <w:sz w:val="16"/>
+          <w:szCs w:val="16"/>
+        </w:rPr>
+        <w:t xml:space="preserve"> fora do horário de corte ou atendimento fora do horário solicitado)</w:t>
       </w:r>
     </w:p>
     <w:p>
@@ -5560,6 +5434,147 @@
           <w:sz w:val="16"/>
           <w:szCs w:val="16"/>
         </w:rPr>
+        <w:t>Horário de corte para colocação de pedidos:</w:t>
+      </w:r>
+      <w:r>
+        <w:rPr>
+          <w:b/>
+          <w:bCs/>
+          <w:sz w:val="16"/>
+          <w:szCs w:val="16"/>
+        </w:rPr>
+        <w:t xml:space="preserve"> </w:t>
+      </w:r>
+      <w:r>
+        <w:rPr>
+          <w:b/>
+          <w:bCs/>
+          <w:sz w:val="16"/>
+          <w:szCs w:val="16"/>
+        </w:rPr>
+        <w:t xml:space="preserve">Até </w:t>
+      </w:r>
+      <w:r>
+        <w:rPr>
+          <w:b/>
+          <w:bCs/>
+          <w:sz w:val="16"/>
+          <w:szCs w:val="16"/>
+        </w:rPr>
+        <w:t>1</w:t>
+      </w:r>
+      <w:r>
+        <w:rPr>
+          <w:b/>
+          <w:bCs/>
+          <w:sz w:val="16"/>
+          <w:szCs w:val="16"/>
+        </w:rPr>
+        <w:t>2</w:t>
+      </w:r>
+      <w:r>
+        <w:rPr>
+          <w:b/>
+          <w:bCs/>
+          <w:sz w:val="16"/>
+          <w:szCs w:val="16"/>
+        </w:rPr>
+        <w:t>:</w:t>
+      </w:r>
+      <w:r>
+        <w:rPr>
+          <w:b/>
+          <w:bCs/>
+          <w:sz w:val="16"/>
+          <w:szCs w:val="16"/>
+        </w:rPr>
+        <w:t>00</w:t>
+      </w:r>
+      <w:r>
+        <w:rPr>
+          <w:b/>
+          <w:bCs/>
+          <w:sz w:val="16"/>
+          <w:szCs w:val="16"/>
+        </w:rPr>
+        <w:t xml:space="preserve"> horas</w:t>
+      </w:r>
+      <w:r>
+        <w:rPr>
+          <w:b/>
+          <w:bCs/>
+          <w:sz w:val="16"/>
+          <w:szCs w:val="16"/>
+        </w:rPr>
+        <w:t xml:space="preserve"> D</w:t>
+      </w:r>
+      <w:r>
+        <w:rPr>
+          <w:b/>
+          <w:bCs/>
+          <w:sz w:val="16"/>
+          <w:szCs w:val="16"/>
+        </w:rPr>
+        <w:t>+</w:t>
+      </w:r>
+      <w:r>
+        <w:rPr>
+          <w:b/>
+          <w:bCs/>
+          <w:sz w:val="16"/>
+          <w:szCs w:val="16"/>
+        </w:rPr>
+        <w:t>1</w:t>
+      </w:r>
+    </w:p>
+    <w:p>
+      <w:pPr>
+        <w:spacing w:line="240" w:lineRule="auto"/>
+        <w:ind w:left="-1276"/>
+        <w:rPr>
+          <w:b/>
+          <w:bCs/>
+          <w:sz w:val="16"/>
+          <w:szCs w:val="16"/>
+        </w:rPr>
+      </w:pPr>
+      <w:r>
+        <w:rPr>
+          <w:b/>
+          <w:bCs/>
+          <w:sz w:val="16"/>
+          <w:szCs w:val="16"/>
+        </w:rPr>
+        <w:t xml:space="preserve">Recebimento / </w:t>
+      </w:r>
+      <w:r>
+        <w:rPr>
+          <w:b/>
+          <w:bCs/>
+          <w:sz w:val="16"/>
+          <w:szCs w:val="16"/>
+        </w:rPr>
+        <w:t>Conforme política de recebimento Anexo II</w:t>
+      </w:r>
+    </w:p>
+    <w:p>
+      <w:pPr>
+        <w:spacing w:line="240" w:lineRule="auto"/>
+        <w:ind w:left="-1276"/>
+        <w:rPr>
+          <w:b/>
+          <w:bCs/>
+          <w:sz w:val="16"/>
+          <w:szCs w:val="16"/>
+        </w:rPr>
+      </w:pPr>
+      <w:r>
+        <w:rPr>
+          <w:b/>
+          <w:bCs/>
+          <w:sz w:val="16"/>
+          <w:szCs w:val="16"/>
+        </w:rPr>
         <w:t>Expedições</w:t>
       </w:r>
       <w:r>
@@ -5648,45 +5663,58 @@
       <w:pPr>
         <w:ind w:left="4248"/>
         <w:rPr>
-          <w:b/>
-          <w:bCs/>
           <w:sz w:val="16"/>
           <w:szCs w:val="16"/>
         </w:rPr>
       </w:pPr>
-      <w:r>
-        <w:rPr>
-          <w:sz w:val="16"/>
-          <w:szCs w:val="16"/>
-        </w:rPr>
-        <w:t>________________________________________________</w:t>
-      </w:r>
-      <w:r>
-        <w:rPr>
-          <w:sz w:val="16"/>
-          <w:szCs w:val="16"/>
-        </w:rPr>
-        <w:br/>
-      </w:r>
-      <w:r>
-        <w:rPr>
-          <w:b/>
-          <w:bCs/>
-          <w:sz w:val="16"/>
-          <w:szCs w:val="16"/>
-        </w:rPr>
-        <w:t>{{NOME_CLIENTE}}</w:t>
-      </w:r>
     </w:p>
     <w:p>
       <w:pPr>
         <w:ind w:left="4248"/>
+        <w:rPr>
+          <w:b/>
+          <w:bCs/>
+          <w:sz w:val="16"/>
+          <w:szCs w:val="16"/>
+        </w:rPr>
       </w:pPr>
       <w:r>
         <w:rPr>
           <w:sz w:val="16"/>
           <w:szCs w:val="16"/>
         </w:rPr>
+        <w:t>________________________________________</w:t>
+      </w:r>
+      <w:r>
+        <w:rPr>
+          <w:sz w:val="16"/>
+          <w:szCs w:val="16"/>
+        </w:rPr>
+        <w:br/>
+      </w:r>
+      <w:r>
+        <w:rPr>
+          <w:b/>
+          <w:bCs/>
+          <w:sz w:val="16"/>
+          <w:szCs w:val="16"/>
+        </w:rPr>
+        <w:t>{{NOME_CLIENTE}}</w:t>
+      </w:r>
+      <w:r>
+        <w:rPr>
+          <w:b/>
+          <w:bCs/>
+          <w:sz w:val="16"/>
+          <w:szCs w:val="16"/>
+        </w:rPr>
+        <w:br/>
+      </w:r>
+      <w:r>
+        <w:rPr>
+          <w:sz w:val="16"/>
+          <w:szCs w:val="16"/>
+        </w:rPr>
         <w:t>CNPJ:</w:t>
       </w:r>
       <w:r>
@@ -5715,7 +5743,13 @@
           <w:szCs w:val="16"/>
         </w:rPr>
         <w:br/>
-        <w:t>_________________________________________________</w:t>
+      </w:r>
+      <w:r>
+        <w:rPr>
+          <w:sz w:val="16"/>
+          <w:szCs w:val="16"/>
+        </w:rPr>
+        <w:t>_________________________________________</w:t>
       </w:r>
       <w:r>
         <w:rPr>

</xml_diff>

<commit_message>
feat: adicionado codigo de controle de revisao e automacao da assinatura do gestor
</commit_message>
<xml_diff>
--- a/templates/modelo.docx
+++ b/templates/modelo.docx
@@ -62,7 +62,7 @@
                 <w:szCs w:val="16"/>
               </w:rPr>
               <w:drawing>
-                <wp:anchor distT="0" distB="0" distL="114300" distR="114300" simplePos="0" relativeHeight="251658240" behindDoc="0" locked="0" layoutInCell="1" allowOverlap="1" wp14:anchorId="3275B5F9" wp14:editId="1BA3EB19">
+                <wp:anchor distT="0" distB="0" distL="114300" distR="114300" simplePos="0" relativeHeight="251658240" behindDoc="0" locked="0" layoutInCell="1" allowOverlap="1" wp14:anchorId="3275B5F9" wp14:editId="1ACA1DD7">
                   <wp:simplePos x="0" y="0"/>
                   <wp:positionH relativeFrom="page">
                     <wp:posOffset>1155065</wp:posOffset>
@@ -148,55 +148,7 @@
                 <w:b/>
                 <w:bCs/>
               </w:rPr>
-              <w:t xml:space="preserve">REF </w:t>
-            </w:r>
-            <w:r>
-              <w:rPr>
-                <w:rFonts w:cstheme="minorHAnsi"/>
-                <w:b/>
-                <w:bCs/>
-              </w:rPr>
-              <w:t>202</w:t>
-            </w:r>
-            <w:r>
-              <w:rPr>
-                <w:rFonts w:cstheme="minorHAnsi"/>
-                <w:b/>
-                <w:bCs/>
-              </w:rPr>
-              <w:t>6</w:t>
-            </w:r>
-            <w:r>
-              <w:rPr>
-                <w:rFonts w:cstheme="minorHAnsi"/>
-                <w:b/>
-                <w:bCs/>
-              </w:rPr>
-              <w:t>0</w:t>
-            </w:r>
-            <w:r>
-              <w:rPr>
-                <w:rFonts w:cstheme="minorHAnsi"/>
-                <w:b/>
-                <w:bCs/>
-              </w:rPr>
-              <w:t>518</w:t>
-            </w:r>
-            <w:r>
-              <w:rPr>
-                <w:rFonts w:cstheme="minorHAnsi"/>
-                <w:b/>
-                <w:bCs/>
-              </w:rPr>
-              <w:t>_R</w:t>
-            </w:r>
-            <w:r>
-              <w:rPr>
-                <w:rFonts w:cstheme="minorHAnsi"/>
-                <w:b/>
-                <w:bCs/>
-              </w:rPr>
-              <w:t>0</w:t>
+              <w:t>{{CODIGO_PROPOSTA}}</w:t>
             </w:r>
           </w:p>
         </w:tc>
@@ -5358,7 +5310,6 @@
           <w:sz w:val="16"/>
           <w:szCs w:val="16"/>
         </w:rPr>
-        <w:lastRenderedPageBreak/>
         <w:t xml:space="preserve">Taxa de urgência: R$ </w:t>
       </w:r>
       <w:r>
@@ -5434,6 +5385,7 @@
           <w:sz w:val="16"/>
           <w:szCs w:val="16"/>
         </w:rPr>
+        <w:lastRenderedPageBreak/>
         <w:t>Horário de corte para colocação de pedidos:</w:t>
       </w:r>
       <w:r>
@@ -5672,25 +5624,32 @@
       <w:pPr>
         <w:ind w:left="4248"/>
         <w:rPr>
+          <w:sz w:val="16"/>
+          <w:szCs w:val="16"/>
+        </w:rPr>
+      </w:pPr>
+      <w:r>
+        <w:rPr>
+          <w:sz w:val="16"/>
+          <w:szCs w:val="16"/>
+        </w:rPr>
+        <w:t>_______________________________</w:t>
+      </w:r>
+      <w:r>
+        <w:rPr>
+          <w:sz w:val="16"/>
+          <w:szCs w:val="16"/>
+        </w:rPr>
+        <w:br/>
+      </w:r>
+      <w:r>
+        <w:rPr>
           <w:b/>
           <w:bCs/>
           <w:sz w:val="16"/>
           <w:szCs w:val="16"/>
         </w:rPr>
-      </w:pPr>
-      <w:r>
-        <w:rPr>
-          <w:sz w:val="16"/>
-          <w:szCs w:val="16"/>
-        </w:rPr>
-        <w:t>________________________________________</w:t>
-      </w:r>
-      <w:r>
-        <w:rPr>
-          <w:sz w:val="16"/>
-          <w:szCs w:val="16"/>
-        </w:rPr>
-        <w:br/>
+        <w:t>{{NOME_CLIENTE}}</w:t>
       </w:r>
       <w:r>
         <w:rPr>
@@ -5699,15 +5658,6 @@
           <w:sz w:val="16"/>
           <w:szCs w:val="16"/>
         </w:rPr>
-        <w:t>{{NOME_CLIENTE}}</w:t>
-      </w:r>
-      <w:r>
-        <w:rPr>
-          <w:b/>
-          <w:bCs/>
-          <w:sz w:val="16"/>
-          <w:szCs w:val="16"/>
-        </w:rPr>
         <w:br/>
       </w:r>
       <w:r>
@@ -5737,19 +5687,42 @@
         </w:rPr>
         <w:br/>
       </w:r>
-      <w:r>
-        <w:rPr>
-          <w:sz w:val="16"/>
-          <w:szCs w:val="16"/>
-        </w:rPr>
-        <w:br/>
-      </w:r>
-      <w:r>
-        <w:rPr>
-          <w:sz w:val="16"/>
-          <w:szCs w:val="16"/>
-        </w:rPr>
-        <w:t>_________________________________________</w:t>
+    </w:p>
+    <w:p>
+      <w:pPr>
+        <w:ind w:left="4248"/>
+        <w:rPr>
+          <w:sz w:val="16"/>
+          <w:szCs w:val="16"/>
+        </w:rPr>
+      </w:pPr>
+    </w:p>
+    <w:p>
+      <w:pPr>
+        <w:ind w:left="4248"/>
+        <w:rPr>
+          <w:sz w:val="16"/>
+          <w:szCs w:val="16"/>
+        </w:rPr>
+      </w:pPr>
+    </w:p>
+    <w:p>
+      <w:pPr>
+        <w:ind w:left="4248"/>
+      </w:pPr>
+      <w:r>
+        <w:rPr>
+          <w:sz w:val="16"/>
+          <w:szCs w:val="16"/>
+        </w:rPr>
+        <w:t>______________________________</w:t>
+      </w:r>
+      <w:r>
+        <w:rPr>
+          <w:sz w:val="16"/>
+          <w:szCs w:val="16"/>
+        </w:rPr>
+        <w:t>{{ASSINATURA}}</w:t>
       </w:r>
       <w:r>
         <w:rPr>
@@ -5814,243 +5787,9 @@
         </w:rPr>
       </w:pPr>
     </w:p>
-    <w:p>
-      <w:pPr>
-        <w:ind w:left="4248"/>
-        <w:rPr>
-          <w:sz w:val="16"/>
-          <w:szCs w:val="16"/>
-        </w:rPr>
-      </w:pPr>
-    </w:p>
-    <w:p>
-      <w:pPr>
-        <w:spacing w:line="215" w:lineRule="exact"/>
-        <w:ind w:left="841" w:right="5234"/>
-        <w:jc w:val="center"/>
-        <w:rPr>
-          <w:rFonts w:ascii="Times New Roman"/>
-          <w:b/>
-          <w:sz w:val="21"/>
-        </w:rPr>
-      </w:pPr>
-      <w:r>
-        <w:rPr>
-          <w:rFonts w:ascii="Times New Roman"/>
-          <w:b/>
-          <w:color w:val="4F708E"/>
-          <w:w w:val="110"/>
-          <w:sz w:val="21"/>
-        </w:rPr>
-        <w:t>33.305.021/0001-74</w:t>
-      </w:r>
-    </w:p>
-    <w:p>
-      <w:pPr>
-        <w:spacing w:before="46" w:line="295" w:lineRule="auto"/>
-        <w:ind w:left="841" w:right="5259"/>
-        <w:jc w:val="center"/>
-        <w:rPr>
-          <w:color w:val="4F708E"/>
-          <w:spacing w:val="-49"/>
-          <w:sz w:val="19"/>
-        </w:rPr>
-      </w:pPr>
-      <w:r>
-        <w:rPr>
-          <w:color w:val="4F708E"/>
-          <w:sz w:val="19"/>
-        </w:rPr>
-        <w:t>LOGCARE</w:t>
-      </w:r>
-      <w:r>
-        <w:rPr>
-          <w:color w:val="4F708E"/>
-          <w:spacing w:val="-7"/>
-          <w:sz w:val="19"/>
-        </w:rPr>
-        <w:t xml:space="preserve"> </w:t>
-      </w:r>
-      <w:r>
-        <w:rPr>
-          <w:color w:val="4F708E"/>
-          <w:sz w:val="19"/>
-        </w:rPr>
-        <w:t>Soluções em Logistica LTDA</w:t>
-      </w:r>
-    </w:p>
-    <w:p>
-      <w:pPr>
-        <w:spacing w:before="46" w:line="295" w:lineRule="auto"/>
-        <w:ind w:left="841" w:right="5259"/>
-        <w:jc w:val="center"/>
-        <w:rPr>
-          <w:sz w:val="19"/>
-        </w:rPr>
-      </w:pPr>
-      <w:r>
-        <w:rPr>
-          <w:color w:val="4F708E"/>
-          <w:sz w:val="19"/>
-        </w:rPr>
-        <w:t>Av</w:t>
-      </w:r>
-      <w:r>
-        <w:rPr>
-          <w:color w:val="6B8099"/>
-          <w:sz w:val="19"/>
-        </w:rPr>
-        <w:t>.</w:t>
-      </w:r>
-      <w:r>
-        <w:rPr>
-          <w:color w:val="6B8099"/>
-          <w:spacing w:val="1"/>
-          <w:sz w:val="19"/>
-        </w:rPr>
-        <w:t xml:space="preserve"> </w:t>
-      </w:r>
-      <w:r>
-        <w:rPr>
-          <w:color w:val="4F708E"/>
-          <w:sz w:val="19"/>
-        </w:rPr>
-        <w:t>Gu</w:t>
-      </w:r>
-      <w:r>
-        <w:rPr>
-          <w:color w:val="4F708E"/>
-          <w:spacing w:val="-32"/>
-          <w:sz w:val="19"/>
-        </w:rPr>
-        <w:t xml:space="preserve"> </w:t>
-      </w:r>
-      <w:r>
-        <w:rPr>
-          <w:color w:val="4F708E"/>
-          <w:sz w:val="19"/>
-        </w:rPr>
-        <w:t>pe</w:t>
-      </w:r>
-      <w:r>
-        <w:rPr>
-          <w:color w:val="6B8099"/>
-          <w:sz w:val="19"/>
-        </w:rPr>
-        <w:t>,</w:t>
-      </w:r>
-      <w:r>
-        <w:rPr>
-          <w:color w:val="6B8099"/>
-          <w:spacing w:val="8"/>
-          <w:sz w:val="19"/>
-        </w:rPr>
-        <w:t xml:space="preserve"> </w:t>
-      </w:r>
-      <w:r>
-        <w:rPr>
-          <w:color w:val="4F708E"/>
-          <w:sz w:val="19"/>
-        </w:rPr>
-        <w:t>10767,</w:t>
-      </w:r>
-      <w:r>
-        <w:rPr>
-          <w:color w:val="4F708E"/>
-          <w:spacing w:val="-3"/>
-          <w:sz w:val="19"/>
-        </w:rPr>
-        <w:t xml:space="preserve"> </w:t>
-      </w:r>
-      <w:r>
-        <w:rPr>
-          <w:color w:val="4F708E"/>
-          <w:sz w:val="19"/>
-        </w:rPr>
-        <w:t>Galpao</w:t>
-      </w:r>
-      <w:r>
-        <w:rPr>
-          <w:color w:val="4F708E"/>
-          <w:spacing w:val="6"/>
-          <w:sz w:val="19"/>
-        </w:rPr>
-        <w:t xml:space="preserve"> </w:t>
-      </w:r>
-      <w:r>
-        <w:rPr>
-          <w:color w:val="4F708E"/>
-          <w:sz w:val="19"/>
-        </w:rPr>
-        <w:t>08,09 e 11</w:t>
-      </w:r>
-    </w:p>
-    <w:p>
-      <w:pPr>
-        <w:rPr>
-          <w:rFonts w:ascii="Italic" w:eastAsia="Times New Roman" w:hAnsi="Italic"/>
-        </w:rPr>
-      </w:pPr>
-      <w:r>
-        <w:rPr>
-          <w:noProof/>
-        </w:rPr>
-        <w:drawing>
-          <wp:inline distT="0" distB="0" distL="0" distR="0" wp14:anchorId="5784BAE8" wp14:editId="1A032C60">
-            <wp:extent cx="1447800" cy="800100"/>
-            <wp:effectExtent l="0" t="0" r="0" b="0"/>
-            <wp:docPr id="12" name="Imagem 12" descr="Interface gráfica do usuário, Aplicativo, Word&#10;&#10;Descrição gerada automaticamente"/>
-            <wp:cNvGraphicFramePr>
-              <a:graphicFrameLocks xmlns:a="http://schemas.openxmlformats.org/drawingml/2006/main" noChangeAspect="1"/>
-            </wp:cNvGraphicFramePr>
-            <a:graphic xmlns:a="http://schemas.openxmlformats.org/drawingml/2006/main">
-              <a:graphicData uri="http://schemas.openxmlformats.org/drawingml/2006/picture">
-                <pic:pic xmlns:pic="http://schemas.openxmlformats.org/drawingml/2006/picture">
-                  <pic:nvPicPr>
-                    <pic:cNvPr id="12" name="Imagem 12" descr="Interface gráfica do usuário, Aplicativo, Word&#10;&#10;Descrição gerada automaticamente"/>
-                    <pic:cNvPicPr/>
-                  </pic:nvPicPr>
-                  <pic:blipFill rotWithShape="1">
-                    <a:blip r:embed="rId9"/>
-                    <a:srcRect l="26649" t="37748" r="54043" b="41817"/>
-                    <a:stretch/>
-                  </pic:blipFill>
-                  <pic:spPr bwMode="auto">
-                    <a:xfrm>
-                      <a:off x="0" y="0"/>
-                      <a:ext cx="1450961" cy="801847"/>
-                    </a:xfrm>
-                    <a:prstGeom prst="rect">
-                      <a:avLst/>
-                    </a:prstGeom>
-                    <a:ln>
-                      <a:noFill/>
-                    </a:ln>
-                    <a:extLst>
-                      <a:ext uri="{53640926-AAD7-44D8-BBD7-CCE9431645EC}">
-                        <a14:shadowObscured xmlns:a14="http://schemas.microsoft.com/office/drawing/2010/main"/>
-                      </a:ext>
-                    </a:extLst>
-                  </pic:spPr>
-                </pic:pic>
-              </a:graphicData>
-            </a:graphic>
-          </wp:inline>
-        </w:drawing>
-      </w:r>
-    </w:p>
-    <w:p>
-      <w:pPr>
-        <w:ind w:left="4248"/>
-        <w:rPr>
-          <w:sz w:val="16"/>
-          <w:szCs w:val="16"/>
-        </w:rPr>
-      </w:pPr>
-    </w:p>
     <w:sectPr>
-      <w:headerReference w:type="default" r:id="rId10"/>
-      <w:footerReference w:type="default" r:id="rId11"/>
+      <w:headerReference w:type="default" r:id="rId9"/>
+      <w:footerReference w:type="default" r:id="rId10"/>
       <w:pgSz w:w="11906" w:h="16838" w:code="9"/>
       <w:pgMar w:top="284" w:right="1701" w:bottom="284" w:left="1701" w:header="0" w:footer="0" w:gutter="0"/>
       <w:pgNumType w:start="1"/>
@@ -6092,154 +5831,55 @@
     <w:pPr>
       <w:pStyle w:val="Rodap"/>
       <w:rPr>
-        <w:sz w:val="16"/>
-        <w:szCs w:val="16"/>
+        <w:color w:val="306359"/>
       </w:rPr>
     </w:pPr>
     <w:r>
       <w:rPr>
+        <w:color w:val="306359"/>
         <w:sz w:val="16"/>
         <w:szCs w:val="16"/>
       </w:rPr>
-      <w:tab/>
+      <w:t>LOGCARE Soluções em Logistica LTDA</w:t>
     </w:r>
     <w:r>
       <w:rPr>
+        <w:color w:val="306359"/>
         <w:sz w:val="16"/>
         <w:szCs w:val="16"/>
       </w:rPr>
-      <w:t xml:space="preserve">Proposta de armazenagem Logcare </w:t>
+      <w:ptab w:relativeTo="margin" w:alignment="center" w:leader="none"/>
     </w:r>
     <w:r>
       <w:rPr>
+        <w:color w:val="306359"/>
+      </w:rPr>
+      <w:t xml:space="preserve"> </w:t>
+    </w:r>
+    <w:r>
+      <w:rPr>
+        <w:color w:val="306359"/>
         <w:sz w:val="16"/>
         <w:szCs w:val="16"/>
       </w:rPr>
-      <w:tab/>
+      <w:t>Avenida Gupê, 10767, Galpão 08,09 e 11</w:t>
     </w:r>
     <w:r>
       <w:rPr>
-        <w:rFonts w:cstheme="minorHAnsi"/>
-        <w:sz w:val="20"/>
-        <w:szCs w:val="20"/>
+        <w:color w:val="306359"/>
+        <w:sz w:val="16"/>
+        <w:szCs w:val="16"/>
       </w:rPr>
-      <w:t xml:space="preserve">Página </w:t>
+      <w:ptab w:relativeTo="margin" w:alignment="right" w:leader="none"/>
     </w:r>
     <w:r>
       <w:rPr>
-        <w:rFonts w:cstheme="minorHAnsi"/>
-        <w:b/>
-        <w:bCs/>
-        <w:sz w:val="20"/>
-        <w:szCs w:val="20"/>
+        <w:color w:val="306359"/>
+        <w:sz w:val="16"/>
+        <w:szCs w:val="16"/>
       </w:rPr>
-      <w:fldChar w:fldCharType="begin"/>
+      <w:t>Proposta de armazenagem</w:t>
     </w:r>
-    <w:r>
-      <w:rPr>
-        <w:rFonts w:cstheme="minorHAnsi"/>
-        <w:b/>
-        <w:bCs/>
-        <w:sz w:val="20"/>
-        <w:szCs w:val="20"/>
-      </w:rPr>
-      <w:instrText>PAGE  \* Arabic  \* MERGEFORMAT</w:instrText>
-    </w:r>
-    <w:r>
-      <w:rPr>
-        <w:rFonts w:cstheme="minorHAnsi"/>
-        <w:b/>
-        <w:bCs/>
-        <w:sz w:val="20"/>
-        <w:szCs w:val="20"/>
-      </w:rPr>
-      <w:fldChar w:fldCharType="separate"/>
-    </w:r>
-    <w:r>
-      <w:rPr>
-        <w:rFonts w:cstheme="minorHAnsi"/>
-        <w:b/>
-        <w:bCs/>
-        <w:noProof/>
-        <w:sz w:val="20"/>
-        <w:szCs w:val="20"/>
-      </w:rPr>
-      <w:t>1</w:t>
-    </w:r>
-    <w:r>
-      <w:rPr>
-        <w:rFonts w:cstheme="minorHAnsi"/>
-        <w:b/>
-        <w:bCs/>
-        <w:sz w:val="20"/>
-        <w:szCs w:val="20"/>
-      </w:rPr>
-      <w:fldChar w:fldCharType="end"/>
-    </w:r>
-    <w:r>
-      <w:rPr>
-        <w:rFonts w:cstheme="minorHAnsi"/>
-        <w:sz w:val="20"/>
-        <w:szCs w:val="20"/>
-      </w:rPr>
-      <w:t xml:space="preserve"> de </w:t>
-    </w:r>
-    <w:r>
-      <w:rPr>
-        <w:rFonts w:cstheme="minorHAnsi"/>
-        <w:b/>
-        <w:bCs/>
-        <w:sz w:val="20"/>
-        <w:szCs w:val="20"/>
-      </w:rPr>
-      <w:fldChar w:fldCharType="begin"/>
-    </w:r>
-    <w:r>
-      <w:rPr>
-        <w:rFonts w:cstheme="minorHAnsi"/>
-        <w:b/>
-        <w:bCs/>
-        <w:sz w:val="20"/>
-        <w:szCs w:val="20"/>
-      </w:rPr>
-      <w:instrText>NUMPAGES  \* Arabic  \* MERGEFORMAT</w:instrText>
-    </w:r>
-    <w:r>
-      <w:rPr>
-        <w:rFonts w:cstheme="minorHAnsi"/>
-        <w:b/>
-        <w:bCs/>
-        <w:sz w:val="20"/>
-        <w:szCs w:val="20"/>
-      </w:rPr>
-      <w:fldChar w:fldCharType="separate"/>
-    </w:r>
-    <w:r>
-      <w:rPr>
-        <w:rFonts w:cstheme="minorHAnsi"/>
-        <w:b/>
-        <w:bCs/>
-        <w:noProof/>
-        <w:sz w:val="20"/>
-        <w:szCs w:val="20"/>
-      </w:rPr>
-      <w:t>2</w:t>
-    </w:r>
-    <w:r>
-      <w:rPr>
-        <w:rFonts w:cstheme="minorHAnsi"/>
-        <w:b/>
-        <w:bCs/>
-        <w:sz w:val="20"/>
-        <w:szCs w:val="20"/>
-      </w:rPr>
-      <w:fldChar w:fldCharType="end"/>
-    </w:r>
-  </w:p>
-  <w:p>
-    <w:pPr>
-      <w:pStyle w:val="Rodap"/>
-    </w:pPr>
   </w:p>
 </w:ftr>
 </file>
@@ -6686,7 +6326,6 @@
   <w:style w:type="character" w:default="1" w:styleId="Fontepargpadro">
     <w:name w:val="Default Paragraph Font"/>
     <w:uiPriority w:val="1"/>
-    <w:semiHidden/>
     <w:unhideWhenUsed/>
   </w:style>
   <w:style w:type="table" w:default="1" w:styleId="Tabelanormal">

</xml_diff>

<commit_message>
Ajustando corretamente o local do campo assinatura
</commit_message>
<xml_diff>
--- a/templates/modelo.docx
+++ b/templates/modelo.docx
@@ -62,7 +62,7 @@
                 <w:szCs w:val="16"/>
               </w:rPr>
               <w:drawing>
-                <wp:anchor distT="0" distB="0" distL="114300" distR="114300" simplePos="0" relativeHeight="251658240" behindDoc="0" locked="0" layoutInCell="1" allowOverlap="1" wp14:anchorId="3275B5F9" wp14:editId="1ACA1DD7">
+                <wp:anchor distT="0" distB="0" distL="114300" distR="114300" simplePos="0" relativeHeight="251658240" behindDoc="0" locked="0" layoutInCell="1" allowOverlap="1" wp14:anchorId="3275B5F9" wp14:editId="2B159BB2">
                   <wp:simplePos x="0" y="0"/>
                   <wp:positionH relativeFrom="page">
                     <wp:posOffset>1155065</wp:posOffset>
@@ -5699,6 +5699,9 @@
     </w:p>
     <w:p>
       <w:pPr>
+        <w:pBdr>
+          <w:bottom w:val="single" w:sz="12" w:space="1" w:color="auto"/>
+        </w:pBdr>
         <w:ind w:left="4248"/>
         <w:rPr>
           <w:sz w:val="16"/>
@@ -5710,13 +5713,6 @@
       <w:pPr>
         <w:ind w:left="4248"/>
       </w:pPr>
-      <w:r>
-        <w:rPr>
-          <w:sz w:val="16"/>
-          <w:szCs w:val="16"/>
-        </w:rPr>
-        <w:t>______________________________</w:t>
-      </w:r>
       <w:r>
         <w:rPr>
           <w:sz w:val="16"/>
@@ -6326,6 +6322,7 @@
   <w:style w:type="character" w:default="1" w:styleId="Fontepargpadro">
     <w:name w:val="Default Paragraph Font"/>
     <w:uiPriority w:val="1"/>
+    <w:semiHidden/>
     <w:unhideWhenUsed/>
   </w:style>
   <w:style w:type="table" w:default="1" w:styleId="Tabelanormal">

</xml_diff>